<commit_message>
feat: Configuracion Aplicacion Android APK
</commit_message>
<xml_diff>
--- a/src/assets/templates/informe-tecnico-template.docx
+++ b/src/assets/templates/informe-tecnico-template.docx
@@ -1513,6 +1513,7 @@
       <w:pPr>
         <w:pStyle w:val="BodyText"/>
         <w:spacing w:before="16"/>
+        <w:jc w:val="center"/>
       </w:pPr>
       <w:r>
         <w:rPr/>
@@ -1523,6 +1524,7 @@
       <w:pPr>
         <w:pStyle w:val="BodyText"/>
         <w:spacing w:before="16"/>
+        <w:jc w:val="center"/>
       </w:pPr>
       <w:r>
         <w:rPr/>
@@ -1533,6 +1535,7 @@
       <w:pPr>
         <w:pStyle w:val="BodyText"/>
         <w:spacing w:before="16"/>
+        <w:jc w:val="center"/>
       </w:pPr>
       <w:r>
         <w:rPr/>
@@ -1543,26 +1546,18 @@
       <w:pPr>
         <w:pStyle w:val="BodyText"/>
         <w:spacing w:before="16"/>
+        <w:jc w:val="center"/>
       </w:pPr>
       <w:r>
         <w:rPr/>
         <w:t xml:space="preserve"> </w:t>
       </w:r>
     </w:p>
-    <w:p>
+    <w:p xmlns:wp14="http://schemas.microsoft.com/office/word/2010/wordml" wp14:textId="7D33779B">
       <w:pPr>
         <w:pStyle w:val="BodyText"/>
-        <w:spacing w:before="16"/>
-      </w:pPr>
-      <w:r>
-        <w:rPr/>
-        <w:t>{/hasFirstImage}</w:t>
-      </w:r>
-    </w:p>
-    <w:p xmlns:wp14="http://schemas.microsoft.com/office/word/2010/wordml" wp14:textId="77777777">
-      <w:pPr>
-        <w:pStyle w:val="BodyText"/>
-        <w:spacing w:after="0"/>
+        <w:spacing w:before="16" w:after="0"/>
+        <w:jc w:val="center"/>
         <w:sectPr>
           <w:type w:val="continuous"/>
           <w:pgSz w:w="11910" w:h="16840" w:orient="portrait"/>
@@ -1570,11 +1565,24 @@
           <w:cols w:num="1"/>
         </w:sectPr>
       </w:pPr>
+      <w:r>
+        <w:rPr/>
+        <w:t>{/</w:t>
+      </w:r>
+      <w:r>
+        <w:rPr/>
+        <w:t>hasFirstImage</w:t>
+      </w:r>
+      <w:r>
+        <w:rPr/>
+        <w:t>}</w:t>
+      </w:r>
     </w:p>
     <w:p>
       <w:pPr>
         <w:pStyle w:val="BodyText"/>
-        <w:ind w:left="0" w:firstLine="140"/>
+        <w:spacing w:after="0"/>
+        <w:jc w:val="center"/>
       </w:pPr>
       <w:r>
         <w:rPr/>
@@ -1582,14 +1590,27 @@
       </w:r>
     </w:p>
     <w:p>
+      <w:pPr/>
+      <w:r>
+        <w:br w:type="page"/>
+      </w:r>
+    </w:p>
+    <w:p>
       <w:pPr>
         <w:pStyle w:val="BodyText"/>
+        <w:spacing w:after="0"/>
+        <w:jc w:val="center"/>
       </w:pPr>
     </w:p>
     <w:p>
       <w:pPr>
         <w:pStyle w:val="BodyText"/>
-      </w:pPr>
+        <w:jc w:val="center"/>
+      </w:pPr>
+      <w:r>
+        <w:rPr/>
+        <w:t>{%img1}</w:t>
+      </w:r>
     </w:p>
     <w:p>
       <w:pPr>
@@ -1604,42 +1625,44 @@
       <w:pPr>
         <w:pStyle w:val="BodyText"/>
       </w:pPr>
+    </w:p>
+    <w:p>
+      <w:pPr>
+        <w:pStyle w:val="BodyText"/>
+      </w:pPr>
+    </w:p>
+    <w:p>
+      <w:pPr>
+        <w:pStyle w:val="BodyText"/>
+        <w:jc w:val="center"/>
+      </w:pPr>
+    </w:p>
+    <w:p>
+      <w:pPr>
+        <w:pStyle w:val="BodyText"/>
+        <w:jc w:val="center"/>
+      </w:pPr>
+    </w:p>
+    <w:p>
+      <w:pPr>
+        <w:pStyle w:val="BodyText"/>
+        <w:jc w:val="center"/>
+      </w:pPr>
+    </w:p>
+    <w:p>
+      <w:pPr>
+        <w:pStyle w:val="BodyText"/>
+        <w:jc w:val="center"/>
+      </w:pPr>
       <w:r>
         <w:rPr/>
-        <w:t>{%img1}</w:t>
+        <w:t>{#img2}</w:t>
       </w:r>
     </w:p>
     <w:p>
       <w:pPr>
         <w:pStyle w:val="BodyText"/>
-      </w:pPr>
-      <w:r>
-        <w:rPr/>
-        <w:t xml:space="preserve"> </w:t>
-      </w:r>
-    </w:p>
-    <w:p>
-      <w:pPr>
-        <w:pStyle w:val="BodyText"/>
-      </w:pPr>
-    </w:p>
-    <w:p>
-      <w:pPr>
-        <w:pStyle w:val="BodyText"/>
-      </w:pPr>
-    </w:p>
-    <w:p>
-      <w:pPr>
-        <w:pStyle w:val="BodyText"/>
-      </w:pPr>
-      <w:r>
-        <w:rPr/>
-        <w:t xml:space="preserve"> </w:t>
-      </w:r>
-    </w:p>
-    <w:p>
-      <w:pPr>
-        <w:pStyle w:val="BodyText"/>
+        <w:jc w:val="center"/>
       </w:pPr>
       <w:r>
         <w:rPr/>
@@ -1649,15 +1672,17 @@
     <w:p>
       <w:pPr>
         <w:pStyle w:val="BodyText"/>
+        <w:jc w:val="center"/>
       </w:pPr>
       <w:r>
         <w:rPr/>
-        <w:t xml:space="preserve"> </w:t>
+        <w:t>{/img2}</w:t>
       </w:r>
     </w:p>
     <w:p>
       <w:pPr>
         <w:pStyle w:val="BodyText"/>
+        <w:jc w:val="center"/>
       </w:pPr>
       <w:r>
         <w:rPr/>

</xml_diff>